<commit_message>
feat: add location to CV contact info
</commit_message>
<xml_diff>
--- a/cv/CV_NGUYEN_TRUNG_HUY_FRONTEND_ATS.docx
+++ b/cv/CV_NGUYEN_TRUNG_HUY_FRONTEND_ATS.docx
@@ -144,6 +144,36 @@
           <w:rtl w:val="0"/>
         </w:rPr>
         <w:t xml:space="preserve">portfolio.cocahome.click</w:t>
+      </w:r>
+    </w:p>
+    <w:p>
+      <w:pPr>
+        <w:spacing w:after="30" w:lineRule="auto"/>
+        <w:rPr>
+          <w:color w:val="1a1a1a"/>
+          <w:sz w:val="21"/>
+          <w:szCs w:val="21"/>
+        </w:rPr>
+      </w:pPr>
+      <w:r>
+        <w:rPr>
+          <w:b w:val="1"/>
+          <w:bCs w:val="1"/>
+          <w:color w:val="2e7d32"/>
+          <w:sz w:val="21"/>
+          <w:szCs w:val="21"/>
+          <w:rtl w:val="0"/>
+        </w:rPr>
+        <w:t xml:space="preserve">Location: </w:t>
+      </w:r>
+      <w:r>
+        <w:rPr>
+          <w:color w:val="1a1a1a"/>
+          <w:sz w:val="21"/>
+          <w:szCs w:val="21"/>
+          <w:rtl w:val="0"/>
+        </w:rPr>
+        <w:t xml:space="preserve">Binh Trung Ward, Ho Chi Minh City, Vietnam</w:t>
       </w:r>
     </w:p>
     <w:p>

</xml_diff>

<commit_message>
feat: add maintenance, Contentful, incident and Lighthouse bullets to Frontend CV
</commit_message>
<xml_diff>
--- a/cv/CV_NGUYEN_TRUNG_HUY_FRONTEND_ATS.docx
+++ b/cv/CV_NGUYEN_TRUNG_HUY_FRONTEND_ATS.docx
@@ -1456,6 +1456,54 @@
           <w:vertAlign w:val="baseline"/>
           <w:rtl w:val="0"/>
         </w:rPr>
+        <w:t xml:space="preserve">Designed Contentful content models and built a custom Editor.js extension for content entry, exporting structured data consumed by the front end</w:t>
+      </w:r>
+      <w:r>
+        <w:rPr>
+          <w:rtl w:val="0"/>
+        </w:rPr>
+      </w:r>
+    </w:p>
+    <w:p>
+      <w:pPr>
+        <w:keepNext w:val="0"/>
+        <w:keepLines w:val="0"/>
+        <w:pageBreakBefore w:val="0"/>
+        <w:widowControl w:val="1"/>
+        <w:numPr>
+          <w:ilvl w:val="0"/>
+          <w:numId w:val="2"/>
+        </w:numPr>
+        <w:pBdr>
+          <w:top w:space="0" w:sz="0" w:val="nil"/>
+          <w:left w:space="0" w:sz="0" w:val="nil"/>
+          <w:bottom w:space="0" w:sz="0" w:val="nil"/>
+          <w:right w:space="0" w:sz="0" w:val="nil"/>
+          <w:between w:space="0" w:sz="0" w:val="nil"/>
+        </w:pBdr>
+        <w:shd w:fill="auto" w:val="clear"/>
+        <w:spacing w:after="40" w:before="0" w:line="240" w:lineRule="auto"/>
+        <w:ind w:left="792" w:right="0" w:hanging="259"/>
+        <w:jc w:val="left"/>
+        <w:rPr/>
+      </w:pPr>
+      <w:r>
+        <w:rPr>
+          <w:rFonts w:ascii="Calibri" w:cs="Calibri" w:eastAsia="Calibri" w:hAnsi="Calibri"/>
+          <w:b w:val="0"/>
+          <w:bCs w:val="0"/>
+          <w:i w:val="0"/>
+          <w:iCs w:val="0"/>
+          <w:smallCaps w:val="0"/>
+          <w:strike w:val="0"/>
+          <w:color w:val="1a1a1a"/>
+          <w:sz w:val="21"/>
+          <w:szCs w:val="21"/>
+          <w:u w:val="none"/>
+          <w:shd w:fill="auto" w:val="clear"/>
+          <w:vertAlign w:val="baseline"/>
+          <w:rtl w:val="0"/>
+        </w:rPr>
         <w:t xml:space="preserve">Build and maintain CI/CD pipelines with GitHub</w:t>
       </w:r>
       <w:r>
@@ -1552,7 +1600,151 @@
           <w:vertAlign w:val="baseline"/>
           <w:rtl w:val="0"/>
         </w:rPr>
+        <w:t xml:space="preserve">Applied security patches and upgraded Node.js (v14/v16 to v22-24) on most maintained projects; updated UI animations and reduced page size on production sites</w:t>
+      </w:r>
+      <w:r>
+        <w:rPr>
+          <w:rtl w:val="0"/>
+        </w:rPr>
+      </w:r>
+    </w:p>
+    <w:p>
+      <w:pPr>
+        <w:keepNext w:val="0"/>
+        <w:keepLines w:val="0"/>
+        <w:pageBreakBefore w:val="0"/>
+        <w:widowControl w:val="1"/>
+        <w:numPr>
+          <w:ilvl w:val="0"/>
+          <w:numId w:val="2"/>
+        </w:numPr>
+        <w:pBdr>
+          <w:top w:space="0" w:sz="0" w:val="nil"/>
+          <w:left w:space="0" w:sz="0" w:val="nil"/>
+          <w:bottom w:space="0" w:sz="0" w:val="nil"/>
+          <w:right w:space="0" w:sz="0" w:val="nil"/>
+          <w:between w:space="0" w:sz="0" w:val="nil"/>
+        </w:pBdr>
+        <w:shd w:fill="auto" w:val="clear"/>
+        <w:spacing w:after="40" w:before="0" w:line="240" w:lineRule="auto"/>
+        <w:ind w:left="792" w:right="0" w:hanging="259"/>
+        <w:jc w:val="left"/>
+        <w:rPr/>
+      </w:pPr>
+      <w:r>
+        <w:rPr>
+          <w:rFonts w:ascii="Calibri" w:cs="Calibri" w:eastAsia="Calibri" w:hAnsi="Calibri"/>
+          <w:b w:val="0"/>
+          <w:bCs w:val="0"/>
+          <w:i w:val="0"/>
+          <w:iCs w:val="0"/>
+          <w:smallCaps w:val="0"/>
+          <w:strike w:val="0"/>
+          <w:color w:val="1a1a1a"/>
+          <w:sz w:val="21"/>
+          <w:szCs w:val="21"/>
+          <w:u w:val="none"/>
+          <w:shd w:fill="auto" w:val="clear"/>
+          <w:vertAlign w:val="baseline"/>
+          <w:rtl w:val="0"/>
+        </w:rPr>
+        <w:t xml:space="preserve">Investigated a production incident on wonderia.jp where Googlebot stopped indexing pages after a multilingual release; worked with the back-end team and traced the root cause to a GCP network component</w:t>
+      </w:r>
+      <w:r>
+        <w:rPr>
+          <w:rtl w:val="0"/>
+        </w:rPr>
+      </w:r>
+    </w:p>
+    <w:p>
+      <w:pPr>
+        <w:keepNext w:val="0"/>
+        <w:keepLines w:val="0"/>
+        <w:pageBreakBefore w:val="0"/>
+        <w:widowControl w:val="1"/>
+        <w:numPr>
+          <w:ilvl w:val="0"/>
+          <w:numId w:val="2"/>
+        </w:numPr>
+        <w:pBdr>
+          <w:top w:space="0" w:sz="0" w:val="nil"/>
+          <w:left w:space="0" w:sz="0" w:val="nil"/>
+          <w:bottom w:space="0" w:sz="0" w:val="nil"/>
+          <w:right w:space="0" w:sz="0" w:val="nil"/>
+          <w:between w:space="0" w:sz="0" w:val="nil"/>
+        </w:pBdr>
+        <w:shd w:fill="auto" w:val="clear"/>
+        <w:spacing w:after="40" w:before="0" w:line="240" w:lineRule="auto"/>
+        <w:ind w:left="792" w:right="0" w:hanging="259"/>
+        <w:jc w:val="left"/>
+        <w:rPr/>
+      </w:pPr>
+      <w:r>
+        <w:rPr>
+          <w:rFonts w:ascii="Calibri" w:cs="Calibri" w:eastAsia="Calibri" w:hAnsi="Calibri"/>
+          <w:b w:val="0"/>
+          <w:bCs w:val="0"/>
+          <w:i w:val="0"/>
+          <w:iCs w:val="0"/>
+          <w:smallCaps w:val="0"/>
+          <w:strike w:val="0"/>
+          <w:color w:val="1a1a1a"/>
+          <w:sz w:val="21"/>
+          <w:szCs w:val="21"/>
+          <w:u w:val="none"/>
+          <w:shd w:fill="auto" w:val="clear"/>
+          <w:vertAlign w:val="baseline"/>
+          <w:rtl w:val="0"/>
+        </w:rPr>
         <w:t xml:space="preserve">Build UI animation with GSAP, Three.js, Animate.js</w:t>
+      </w:r>
+      <w:r>
+        <w:rPr>
+          <w:rtl w:val="0"/>
+        </w:rPr>
+      </w:r>
+    </w:p>
+    <w:p>
+      <w:pPr>
+        <w:keepNext w:val="0"/>
+        <w:keepLines w:val="0"/>
+        <w:pageBreakBefore w:val="0"/>
+        <w:widowControl w:val="1"/>
+        <w:numPr>
+          <w:ilvl w:val="0"/>
+          <w:numId w:val="2"/>
+        </w:numPr>
+        <w:pBdr>
+          <w:top w:space="0" w:sz="0" w:val="nil"/>
+          <w:left w:space="0" w:sz="0" w:val="nil"/>
+          <w:bottom w:space="0" w:sz="0" w:val="nil"/>
+          <w:right w:space="0" w:sz="0" w:val="nil"/>
+          <w:between w:space="0" w:sz="0" w:val="nil"/>
+        </w:pBdr>
+        <w:shd w:fill="auto" w:val="clear"/>
+        <w:spacing w:after="40" w:before="0" w:line="240" w:lineRule="auto"/>
+        <w:ind w:left="792" w:right="0" w:hanging="259"/>
+        <w:jc w:val="left"/>
+        <w:rPr/>
+      </w:pPr>
+      <w:r>
+        <w:rPr>
+          <w:rFonts w:ascii="Calibri" w:cs="Calibri" w:eastAsia="Calibri" w:hAnsi="Calibri"/>
+          <w:b w:val="0"/>
+          <w:bCs w:val="0"/>
+          <w:i w:val="0"/>
+          <w:iCs w:val="0"/>
+          <w:smallCaps w:val="0"/>
+          <w:strike w:val="0"/>
+          <w:color w:val="1a1a1a"/>
+          <w:sz w:val="21"/>
+          <w:szCs w:val="21"/>
+          <w:u w:val="none"/>
+          <w:shd w:fill="auto" w:val="clear"/>
+          <w:vertAlign w:val="baseline"/>
+          <w:rtl w:val="0"/>
+        </w:rPr>
+        <w:t xml:space="preserve">Owner of the front-end of wonderia.jp and dena-ailink.com; Lighthouse (Oct 2026): SEO 100/100 and Accessibility 89-90 on both, dena-ailink.com Best Practices 100 and desktop Performance 91 (LCP 1.1s)</w:t>
       </w:r>
       <w:r>
         <w:rPr>

</xml_diff>

<commit_message>
feat: rewrite Frontend CV objective and add GO Job project
</commit_message>
<xml_diff>
--- a/cv/CV_NGUYEN_TRUNG_HUY_FRONTEND_ATS.docx
+++ b/cv/CV_NGUYEN_TRUNG_HUY_FRONTEND_ATS.docx
@@ -214,7 +214,7 @@
           <w:szCs w:val="21"/>
           <w:rtl w:val="0"/>
         </w:rPr>
-        <w:t xml:space="preserve">I have more than 7 years of experience as a Front-End Developer, working on complex web projects for Japanese clients using React, Next.js, Vue.js, Nuxt.js, Vite and Node.js. I also have hands-on experience integrating Contentful CMS, building CI/CD pipelines with GitHub, and creating interactive UI animations with GSAP and Three.js. My long-term goal is to grow into a Fullstack Developer, and I am also interested in exploring a Technical Support path where I can apply my technical background to troubleshoot complex systems and support clients effectively.</w:t>
+        <w:t xml:space="preserve">Front-End Developer with 7+ years building and maintaining production websites for Japanese clients, including the DeNA group (Next.js, Nuxt.js, React, Vue.js). Owner of the wonderia.jp and dena-ailink.com front-end: upgraded Node.js to v22-24, applied security patches, and traced a Googlebot indexing outage to a GCP network component with the back-end team. Experienced with Contentful (content modeling, custom Editor.js extension), GitHub Actions CI/CD and GSAP/Three.js animation. Built Node.js API-integration services for GO Job, a driver recruitment site later handed over to the client. Long-term goal: grow into a Fullstack Developer, currently strengthening SQL and database skills.</w:t>
       </w:r>
       <w:r>
         <w:rPr>
@@ -2078,6 +2078,54 @@
           <w:rtl w:val="0"/>
         </w:rPr>
         <w:t xml:space="preserve">Gambaru — recruitment platform connecting recruiters and job seekers (Next.js, GraphQL, Redux, SCSS). Position: Maintain and fix logic/UI bugs</w:t>
+      </w:r>
+      <w:r>
+        <w:rPr>
+          <w:rtl w:val="0"/>
+        </w:rPr>
+      </w:r>
+    </w:p>
+    <w:p>
+      <w:pPr>
+        <w:keepNext w:val="0"/>
+        <w:keepLines w:val="0"/>
+        <w:pageBreakBefore w:val="0"/>
+        <w:widowControl w:val="1"/>
+        <w:numPr>
+          <w:ilvl w:val="0"/>
+          <w:numId w:val="2"/>
+        </w:numPr>
+        <w:pBdr>
+          <w:top w:space="0" w:sz="0" w:val="nil"/>
+          <w:left w:space="0" w:sz="0" w:val="nil"/>
+          <w:bottom w:space="0" w:sz="0" w:val="nil"/>
+          <w:right w:space="0" w:sz="0" w:val="nil"/>
+          <w:between w:space="0" w:sz="0" w:val="nil"/>
+        </w:pBdr>
+        <w:shd w:fill="auto" w:val="clear"/>
+        <w:spacing w:after="40" w:before="0" w:line="240" w:lineRule="auto"/>
+        <w:ind w:left="792" w:right="0" w:hanging="259"/>
+        <w:jc w:val="left"/>
+        <w:rPr/>
+      </w:pPr>
+      <w:r>
+        <w:rPr>
+          <w:rFonts w:ascii="Calibri" w:cs="Calibri" w:eastAsia="Calibri" w:hAnsi="Calibri"/>
+          <w:b w:val="0"/>
+          <w:bCs w:val="0"/>
+          <w:i w:val="0"/>
+          <w:iCs w:val="0"/>
+          <w:smallCaps w:val="0"/>
+          <w:strike w:val="0"/>
+          <w:color w:val="1a1a1a"/>
+          <w:sz w:val="21"/>
+          <w:szCs w:val="21"/>
+          <w:u w:val="none"/>
+          <w:shd w:fill="auto" w:val="clear"/>
+          <w:vertAlign w:val="baseline"/>
+          <w:rtl w:val="0"/>
+        </w:rPr>
+        <w:t xml:space="preserve">GO Job — driver recruitment site (Node.js API integration). Position: Develop; handed over to the client's in-house team</w:t>
       </w:r>
       <w:r>
         <w:rPr>

</xml_diff>

<commit_message>
feat: group Frontend CV skills and drop outdated ones
</commit_message>
<xml_diff>
--- a/cv/CV_NGUYEN_TRUNG_HUY_FRONTEND_ATS.docx
+++ b/cv/CV_NGUYEN_TRUNG_HUY_FRONTEND_ATS.docx
@@ -311,7 +311,7 @@
           <w:vertAlign w:val="baseline"/>
           <w:rtl w:val="0"/>
         </w:rPr>
-        <w:t xml:space="preserve">HTML5, CSS3, Bootstrap</w:t>
+        <w:t xml:space="preserve">Front-end: Next.js, Nuxt.js, React.js, Vue.js, Vite, HTML5, CSS3, SASS, Tailwind CSS, responsive design</w:t>
       </w:r>
       <w:r>
         <w:rPr>
@@ -359,7 +359,7 @@
           <w:vertAlign w:val="baseline"/>
           <w:rtl w:val="0"/>
         </w:rPr>
-        <w:t xml:space="preserve">Frontend frameworks &amp; libraries: React.js, React Native, Vue.js, Next.js, Nuxt.js, Vite</w:t>
+        <w:t xml:space="preserve">Animation &amp; 3D: GSAP, Three.js, Animate.js</w:t>
       </w:r>
       <w:r>
         <w:rPr>
@@ -407,7 +407,7 @@
           <w:vertAlign w:val="baseline"/>
           <w:rtl w:val="0"/>
         </w:rPr>
-        <w:t xml:space="preserve">React ecosystem: Redux, Redux-Saga, Axios, Ant Design</w:t>
+        <w:t xml:space="preserve">CMS: Contentful (content modeling, custom extension development)</w:t>
       </w:r>
       <w:r>
         <w:rPr>
@@ -455,7 +455,7 @@
           <w:vertAlign w:val="baseline"/>
           <w:rtl w:val="0"/>
         </w:rPr>
-        <w:t xml:space="preserve">Node.js (back-end / runtime maintenance)</w:t>
+        <w:t xml:space="preserve">Back-end &amp; API: Node.js (runtime maintenance, API integration), RESTful API, GraphQL, Axios</w:t>
       </w:r>
       <w:r>
         <w:rPr>
@@ -503,7 +503,7 @@
           <w:vertAlign w:val="baseline"/>
           <w:rtl w:val="0"/>
         </w:rPr>
-        <w:t xml:space="preserve">Animation &amp; 3D: GSAP, Three.js, Animate.js</w:t>
+        <w:t xml:space="preserve">CI/CD &amp; tooling: GitHub Actions, Git</w:t>
       </w:r>
       <w:r>
         <w:rPr>
@@ -551,7 +551,7 @@
           <w:vertAlign w:val="baseline"/>
           <w:rtl w:val="0"/>
         </w:rPr>
-        <w:t xml:space="preserve">CMS: Contentful (custom extension development)</w:t>
+        <w:t xml:space="preserve">State &amp; UI libraries: Redux, Redux-Saga, Ant Design</w:t>
       </w:r>
       <w:r>
         <w:rPr>
@@ -599,295 +599,7 @@
           <w:vertAlign w:val="baseline"/>
           <w:rtl w:val="0"/>
         </w:rPr>
-        <w:t xml:space="preserve">CI/CD: GitHub Actions</w:t>
-      </w:r>
-      <w:r>
-        <w:rPr>
-          <w:rtl w:val="0"/>
-        </w:rPr>
-      </w:r>
-    </w:p>
-    <w:p>
-      <w:pPr>
-        <w:keepNext w:val="0"/>
-        <w:keepLines w:val="0"/>
-        <w:pageBreakBefore w:val="0"/>
-        <w:widowControl w:val="1"/>
-        <w:numPr>
-          <w:ilvl w:val="0"/>
-          <w:numId w:val="1"/>
-        </w:numPr>
-        <w:pBdr>
-          <w:top w:space="0" w:sz="0" w:val="nil"/>
-          <w:left w:space="0" w:sz="0" w:val="nil"/>
-          <w:bottom w:space="0" w:sz="0" w:val="nil"/>
-          <w:right w:space="0" w:sz="0" w:val="nil"/>
-          <w:between w:space="0" w:sz="0" w:val="nil"/>
-        </w:pBdr>
-        <w:shd w:fill="auto" w:val="clear"/>
-        <w:spacing w:after="40" w:before="0" w:line="240" w:lineRule="auto"/>
-        <w:ind w:left="403" w:right="0" w:hanging="259"/>
-        <w:jc w:val="left"/>
-        <w:rPr/>
-      </w:pPr>
-      <w:r>
-        <w:rPr>
-          <w:rFonts w:ascii="Calibri" w:cs="Calibri" w:eastAsia="Calibri" w:hAnsi="Calibri"/>
-          <w:b w:val="0"/>
-          <w:bCs w:val="0"/>
-          <w:i w:val="0"/>
-          <w:iCs w:val="0"/>
-          <w:smallCaps w:val="0"/>
-          <w:strike w:val="0"/>
-          <w:color w:val="1a1a1a"/>
-          <w:sz w:val="21"/>
-          <w:szCs w:val="21"/>
-          <w:u w:val="none"/>
-          <w:shd w:fill="auto" w:val="clear"/>
-          <w:vertAlign w:val="baseline"/>
-          <w:rtl w:val="0"/>
-        </w:rPr>
-        <w:t xml:space="preserve">CSS preprocessing: SASS, Tailwind CSS</w:t>
-      </w:r>
-      <w:r>
-        <w:rPr>
-          <w:rtl w:val="0"/>
-        </w:rPr>
-      </w:r>
-    </w:p>
-    <w:p>
-      <w:pPr>
-        <w:keepNext w:val="0"/>
-        <w:keepLines w:val="0"/>
-        <w:pageBreakBefore w:val="0"/>
-        <w:widowControl w:val="1"/>
-        <w:numPr>
-          <w:ilvl w:val="0"/>
-          <w:numId w:val="1"/>
-        </w:numPr>
-        <w:pBdr>
-          <w:top w:space="0" w:sz="0" w:val="nil"/>
-          <w:left w:space="0" w:sz="0" w:val="nil"/>
-          <w:bottom w:space="0" w:sz="0" w:val="nil"/>
-          <w:right w:space="0" w:sz="0" w:val="nil"/>
-          <w:between w:space="0" w:sz="0" w:val="nil"/>
-        </w:pBdr>
-        <w:shd w:fill="auto" w:val="clear"/>
-        <w:spacing w:after="40" w:before="0" w:line="240" w:lineRule="auto"/>
-        <w:ind w:left="403" w:right="0" w:hanging="259"/>
-        <w:jc w:val="left"/>
-        <w:rPr/>
-      </w:pPr>
-      <w:r>
-        <w:rPr>
-          <w:rFonts w:ascii="Calibri" w:cs="Calibri" w:eastAsia="Calibri" w:hAnsi="Calibri"/>
-          <w:b w:val="0"/>
-          <w:bCs w:val="0"/>
-          <w:i w:val="0"/>
-          <w:iCs w:val="0"/>
-          <w:smallCaps w:val="0"/>
-          <w:strike w:val="0"/>
-          <w:color w:val="1a1a1a"/>
-          <w:sz w:val="21"/>
-          <w:szCs w:val="21"/>
-          <w:u w:val="none"/>
-          <w:shd w:fill="auto" w:val="clear"/>
-          <w:vertAlign w:val="baseline"/>
-          <w:rtl w:val="0"/>
-        </w:rPr>
-        <w:t xml:space="preserve">Responsive design for mobile</w:t>
-      </w:r>
-      <w:r>
-        <w:rPr>
-          <w:rtl w:val="0"/>
-        </w:rPr>
-      </w:r>
-    </w:p>
-    <w:p>
-      <w:pPr>
-        <w:keepNext w:val="0"/>
-        <w:keepLines w:val="0"/>
-        <w:pageBreakBefore w:val="0"/>
-        <w:widowControl w:val="1"/>
-        <w:numPr>
-          <w:ilvl w:val="0"/>
-          <w:numId w:val="1"/>
-        </w:numPr>
-        <w:pBdr>
-          <w:top w:space="0" w:sz="0" w:val="nil"/>
-          <w:left w:space="0" w:sz="0" w:val="nil"/>
-          <w:bottom w:space="0" w:sz="0" w:val="nil"/>
-          <w:right w:space="0" w:sz="0" w:val="nil"/>
-          <w:between w:space="0" w:sz="0" w:val="nil"/>
-        </w:pBdr>
-        <w:shd w:fill="auto" w:val="clear"/>
-        <w:spacing w:after="40" w:before="0" w:line="240" w:lineRule="auto"/>
-        <w:ind w:left="403" w:right="0" w:hanging="259"/>
-        <w:jc w:val="left"/>
-        <w:rPr/>
-      </w:pPr>
-      <w:r>
-        <w:rPr>
-          <w:rFonts w:ascii="Calibri" w:cs="Calibri" w:eastAsia="Calibri" w:hAnsi="Calibri"/>
-          <w:b w:val="0"/>
-          <w:bCs w:val="0"/>
-          <w:i w:val="0"/>
-          <w:iCs w:val="0"/>
-          <w:smallCaps w:val="0"/>
-          <w:strike w:val="0"/>
-          <w:color w:val="1a1a1a"/>
-          <w:sz w:val="21"/>
-          <w:szCs w:val="21"/>
-          <w:u w:val="none"/>
-          <w:shd w:fill="auto" w:val="clear"/>
-          <w:vertAlign w:val="baseline"/>
-          <w:rtl w:val="0"/>
-        </w:rPr>
-        <w:t xml:space="preserve">Git and version control</w:t>
-      </w:r>
-      <w:r>
-        <w:rPr>
-          <w:rtl w:val="0"/>
-        </w:rPr>
-      </w:r>
-    </w:p>
-    <w:p>
-      <w:pPr>
-        <w:keepNext w:val="0"/>
-        <w:keepLines w:val="0"/>
-        <w:pageBreakBefore w:val="0"/>
-        <w:widowControl w:val="1"/>
-        <w:numPr>
-          <w:ilvl w:val="0"/>
-          <w:numId w:val="1"/>
-        </w:numPr>
-        <w:pBdr>
-          <w:top w:space="0" w:sz="0" w:val="nil"/>
-          <w:left w:space="0" w:sz="0" w:val="nil"/>
-          <w:bottom w:space="0" w:sz="0" w:val="nil"/>
-          <w:right w:space="0" w:sz="0" w:val="nil"/>
-          <w:between w:space="0" w:sz="0" w:val="nil"/>
-        </w:pBdr>
-        <w:shd w:fill="auto" w:val="clear"/>
-        <w:spacing w:after="40" w:before="0" w:line="240" w:lineRule="auto"/>
-        <w:ind w:left="403" w:right="0" w:hanging="259"/>
-        <w:jc w:val="left"/>
-        <w:rPr/>
-      </w:pPr>
-      <w:r>
-        <w:rPr>
-          <w:rFonts w:ascii="Calibri" w:cs="Calibri" w:eastAsia="Calibri" w:hAnsi="Calibri"/>
-          <w:b w:val="0"/>
-          <w:bCs w:val="0"/>
-          <w:i w:val="0"/>
-          <w:iCs w:val="0"/>
-          <w:smallCaps w:val="0"/>
-          <w:strike w:val="0"/>
-          <w:color w:val="1a1a1a"/>
-          <w:sz w:val="21"/>
-          <w:szCs w:val="21"/>
-          <w:u w:val="none"/>
-          <w:shd w:fill="auto" w:val="clear"/>
-          <w:vertAlign w:val="baseline"/>
-          <w:rtl w:val="0"/>
-        </w:rPr>
-        <w:t xml:space="preserve">Testing and debugging</w:t>
-      </w:r>
-      <w:r>
-        <w:rPr>
-          <w:rtl w:val="0"/>
-        </w:rPr>
-      </w:r>
-    </w:p>
-    <w:p>
-      <w:pPr>
-        <w:keepNext w:val="0"/>
-        <w:keepLines w:val="0"/>
-        <w:pageBreakBefore w:val="0"/>
-        <w:widowControl w:val="1"/>
-        <w:numPr>
-          <w:ilvl w:val="0"/>
-          <w:numId w:val="1"/>
-        </w:numPr>
-        <w:pBdr>
-          <w:top w:space="0" w:sz="0" w:val="nil"/>
-          <w:left w:space="0" w:sz="0" w:val="nil"/>
-          <w:bottom w:space="0" w:sz="0" w:val="nil"/>
-          <w:right w:space="0" w:sz="0" w:val="nil"/>
-          <w:between w:space="0" w:sz="0" w:val="nil"/>
-        </w:pBdr>
-        <w:shd w:fill="auto" w:val="clear"/>
-        <w:spacing w:after="40" w:before="0" w:line="240" w:lineRule="auto"/>
-        <w:ind w:left="403" w:right="0" w:hanging="259"/>
-        <w:jc w:val="left"/>
-        <w:rPr/>
-      </w:pPr>
-      <w:r>
-        <w:rPr>
-          <w:rFonts w:ascii="Calibri" w:cs="Calibri" w:eastAsia="Calibri" w:hAnsi="Calibri"/>
-          <w:b w:val="0"/>
-          <w:bCs w:val="0"/>
-          <w:i w:val="0"/>
-          <w:iCs w:val="0"/>
-          <w:smallCaps w:val="0"/>
-          <w:strike w:val="0"/>
-          <w:color w:val="1a1a1a"/>
-          <w:sz w:val="21"/>
-          <w:szCs w:val="21"/>
-          <w:u w:val="none"/>
-          <w:shd w:fill="auto" w:val="clear"/>
-          <w:vertAlign w:val="baseline"/>
-          <w:rtl w:val="0"/>
-        </w:rPr>
-        <w:t xml:space="preserve">RESTful API integration, GraphQL</w:t>
-      </w:r>
-      <w:r>
-        <w:rPr>
-          <w:rtl w:val="0"/>
-        </w:rPr>
-      </w:r>
-    </w:p>
-    <w:p>
-      <w:pPr>
-        <w:keepNext w:val="0"/>
-        <w:keepLines w:val="0"/>
-        <w:pageBreakBefore w:val="0"/>
-        <w:widowControl w:val="1"/>
-        <w:numPr>
-          <w:ilvl w:val="0"/>
-          <w:numId w:val="1"/>
-        </w:numPr>
-        <w:pBdr>
-          <w:top w:space="0" w:sz="0" w:val="nil"/>
-          <w:left w:space="0" w:sz="0" w:val="nil"/>
-          <w:bottom w:space="0" w:sz="0" w:val="nil"/>
-          <w:right w:space="0" w:sz="0" w:val="nil"/>
-          <w:between w:space="0" w:sz="0" w:val="nil"/>
-        </w:pBdr>
-        <w:shd w:fill="auto" w:val="clear"/>
-        <w:spacing w:after="40" w:before="0" w:line="240" w:lineRule="auto"/>
-        <w:ind w:left="403" w:right="0" w:hanging="259"/>
-        <w:jc w:val="left"/>
-        <w:rPr/>
-      </w:pPr>
-      <w:r>
-        <w:rPr>
-          <w:rFonts w:ascii="Calibri" w:cs="Calibri" w:eastAsia="Calibri" w:hAnsi="Calibri"/>
-          <w:b w:val="0"/>
-          <w:bCs w:val="0"/>
-          <w:i w:val="0"/>
-          <w:iCs w:val="0"/>
-          <w:smallCaps w:val="0"/>
-          <w:strike w:val="0"/>
-          <w:color w:val="1a1a1a"/>
-          <w:sz w:val="21"/>
-          <w:szCs w:val="21"/>
-          <w:u w:val="none"/>
-          <w:shd w:fill="auto" w:val="clear"/>
-          <w:vertAlign w:val="baseline"/>
-          <w:rtl w:val="0"/>
-        </w:rPr>
-        <w:t xml:space="preserve">UI/UX experience, Photoshop</w:t>
+        <w:t xml:space="preserve">Mobile: React Native</w:t>
       </w:r>
       <w:r>
         <w:rPr>

</xml_diff>

<commit_message>
feat: update Frontend CV projects, experience, education and language
</commit_message>
<xml_diff>
--- a/cv/CV_NGUYEN_TRUNG_HUY_FRONTEND_ATS.docx
+++ b/cv/CV_NGUYEN_TRUNG_HUY_FRONTEND_ATS.docx
@@ -670,270 +670,7 @@
           <w:vertAlign w:val="baseline"/>
           <w:rtl w:val="0"/>
         </w:rPr>
-        <w:t xml:space="preserve">Eager to learn new technologies</w:t>
-      </w:r>
-      <w:r>
-        <w:rPr>
-          <w:rtl w:val="0"/>
-        </w:rPr>
-      </w:r>
-    </w:p>
-    <w:p>
-      <w:pPr>
-        <w:keepNext w:val="0"/>
-        <w:keepLines w:val="0"/>
-        <w:pageBreakBefore w:val="0"/>
-        <w:widowControl w:val="1"/>
-        <w:numPr>
-          <w:ilvl w:val="0"/>
-          <w:numId w:val="1"/>
-        </w:numPr>
-        <w:pBdr>
-          <w:top w:space="0" w:sz="0" w:val="nil"/>
-          <w:left w:space="0" w:sz="0" w:val="nil"/>
-          <w:bottom w:space="0" w:sz="0" w:val="nil"/>
-          <w:right w:space="0" w:sz="0" w:val="nil"/>
-          <w:between w:space="0" w:sz="0" w:val="nil"/>
-        </w:pBdr>
-        <w:shd w:fill="auto" w:val="clear"/>
-        <w:spacing w:after="40" w:before="0" w:line="240" w:lineRule="auto"/>
-        <w:ind w:left="403" w:right="0" w:hanging="259"/>
-        <w:jc w:val="left"/>
-        <w:rPr/>
-      </w:pPr>
-      <w:r>
-        <w:rPr>
-          <w:rFonts w:ascii="Calibri" w:cs="Calibri" w:eastAsia="Calibri" w:hAnsi="Calibri"/>
-          <w:b w:val="0"/>
-          <w:bCs w:val="0"/>
-          <w:i w:val="0"/>
-          <w:iCs w:val="0"/>
-          <w:smallCaps w:val="0"/>
-          <w:strike w:val="0"/>
-          <w:color w:val="1a1a1a"/>
-          <w:sz w:val="21"/>
-          <w:szCs w:val="21"/>
-          <w:u w:val="none"/>
-          <w:shd w:fill="auto" w:val="clear"/>
-          <w:vertAlign w:val="baseline"/>
-          <w:rtl w:val="0"/>
-        </w:rPr>
-        <w:t xml:space="preserve">Teamwork</w:t>
-      </w:r>
-      <w:r>
-        <w:rPr>
-          <w:rtl w:val="0"/>
-        </w:rPr>
-      </w:r>
-    </w:p>
-    <w:p>
-      <w:pPr>
-        <w:keepNext w:val="0"/>
-        <w:keepLines w:val="0"/>
-        <w:pageBreakBefore w:val="0"/>
-        <w:widowControl w:val="1"/>
-        <w:numPr>
-          <w:ilvl w:val="0"/>
-          <w:numId w:val="1"/>
-        </w:numPr>
-        <w:pBdr>
-          <w:top w:space="0" w:sz="0" w:val="nil"/>
-          <w:left w:space="0" w:sz="0" w:val="nil"/>
-          <w:bottom w:space="0" w:sz="0" w:val="nil"/>
-          <w:right w:space="0" w:sz="0" w:val="nil"/>
-          <w:between w:space="0" w:sz="0" w:val="nil"/>
-        </w:pBdr>
-        <w:shd w:fill="auto" w:val="clear"/>
-        <w:spacing w:after="40" w:before="0" w:line="240" w:lineRule="auto"/>
-        <w:ind w:left="403" w:right="0" w:hanging="259"/>
-        <w:jc w:val="left"/>
-        <w:rPr/>
-      </w:pPr>
-      <w:r>
-        <w:rPr>
-          <w:rFonts w:ascii="Calibri" w:cs="Calibri" w:eastAsia="Calibri" w:hAnsi="Calibri"/>
-          <w:b w:val="0"/>
-          <w:bCs w:val="0"/>
-          <w:i w:val="0"/>
-          <w:iCs w:val="0"/>
-          <w:smallCaps w:val="0"/>
-          <w:strike w:val="0"/>
-          <w:color w:val="1a1a1a"/>
-          <w:sz w:val="21"/>
-          <w:szCs w:val="21"/>
-          <w:u w:val="none"/>
-          <w:shd w:fill="auto" w:val="clear"/>
-          <w:vertAlign w:val="baseline"/>
-          <w:rtl w:val="0"/>
-        </w:rPr>
-        <w:t xml:space="preserve">Time management</w:t>
-      </w:r>
-      <w:r>
-        <w:rPr>
-          <w:rtl w:val="0"/>
-        </w:rPr>
-      </w:r>
-    </w:p>
-    <w:p>
-      <w:pPr>
-        <w:keepNext w:val="0"/>
-        <w:keepLines w:val="0"/>
-        <w:pageBreakBefore w:val="0"/>
-        <w:widowControl w:val="1"/>
-        <w:numPr>
-          <w:ilvl w:val="0"/>
-          <w:numId w:val="1"/>
-        </w:numPr>
-        <w:pBdr>
-          <w:top w:space="0" w:sz="0" w:val="nil"/>
-          <w:left w:space="0" w:sz="0" w:val="nil"/>
-          <w:bottom w:space="0" w:sz="0" w:val="nil"/>
-          <w:right w:space="0" w:sz="0" w:val="nil"/>
-          <w:between w:space="0" w:sz="0" w:val="nil"/>
-        </w:pBdr>
-        <w:shd w:fill="auto" w:val="clear"/>
-        <w:spacing w:after="40" w:before="0" w:line="240" w:lineRule="auto"/>
-        <w:ind w:left="403" w:right="0" w:hanging="259"/>
-        <w:jc w:val="left"/>
-        <w:rPr/>
-      </w:pPr>
-      <w:r>
-        <w:rPr>
-          <w:rFonts w:ascii="Calibri" w:cs="Calibri" w:eastAsia="Calibri" w:hAnsi="Calibri"/>
-          <w:b w:val="0"/>
-          <w:bCs w:val="0"/>
-          <w:i w:val="0"/>
-          <w:iCs w:val="0"/>
-          <w:smallCaps w:val="0"/>
-          <w:strike w:val="0"/>
-          <w:color w:val="1a1a1a"/>
-          <w:sz w:val="21"/>
-          <w:szCs w:val="21"/>
-          <w:u w:val="none"/>
-          <w:shd w:fill="auto" w:val="clear"/>
-          <w:vertAlign w:val="baseline"/>
-          <w:rtl w:val="0"/>
-        </w:rPr>
-        <w:t xml:space="preserve">Business communication</w:t>
-      </w:r>
-      <w:r>
-        <w:rPr>
-          <w:rtl w:val="0"/>
-        </w:rPr>
-      </w:r>
-    </w:p>
-    <w:p>
-      <w:pPr>
-        <w:keepNext w:val="0"/>
-        <w:keepLines w:val="0"/>
-        <w:pageBreakBefore w:val="0"/>
-        <w:widowControl w:val="1"/>
-        <w:numPr>
-          <w:ilvl w:val="0"/>
-          <w:numId w:val="1"/>
-        </w:numPr>
-        <w:pBdr>
-          <w:top w:space="0" w:sz="0" w:val="nil"/>
-          <w:left w:space="0" w:sz="0" w:val="nil"/>
-          <w:bottom w:space="0" w:sz="0" w:val="nil"/>
-          <w:right w:space="0" w:sz="0" w:val="nil"/>
-          <w:between w:space="0" w:sz="0" w:val="nil"/>
-        </w:pBdr>
-        <w:shd w:fill="auto" w:val="clear"/>
-        <w:spacing w:after="40" w:before="0" w:line="240" w:lineRule="auto"/>
-        <w:ind w:left="403" w:right="0" w:hanging="259"/>
-        <w:jc w:val="left"/>
-        <w:rPr/>
-      </w:pPr>
-      <w:r>
-        <w:rPr>
-          <w:rFonts w:ascii="Calibri" w:cs="Calibri" w:eastAsia="Calibri" w:hAnsi="Calibri"/>
-          <w:b w:val="0"/>
-          <w:bCs w:val="0"/>
-          <w:i w:val="0"/>
-          <w:iCs w:val="0"/>
-          <w:smallCaps w:val="0"/>
-          <w:strike w:val="0"/>
-          <w:color w:val="1a1a1a"/>
-          <w:sz w:val="21"/>
-          <w:szCs w:val="21"/>
-          <w:u w:val="none"/>
-          <w:shd w:fill="auto" w:val="clear"/>
-          <w:vertAlign w:val="baseline"/>
-          <w:rtl w:val="0"/>
-        </w:rPr>
-        <w:t xml:space="preserve">Friendly and sociable, good communication</w:t>
-      </w:r>
-      <w:r>
-        <w:rPr>
-          <w:rtl w:val="0"/>
-        </w:rPr>
-      </w:r>
-    </w:p>
-    <w:p>
-      <w:pPr>
-        <w:spacing w:after="40" w:before="80" w:lineRule="auto"/>
-        <w:rPr/>
-      </w:pPr>
-      <w:r>
-        <w:rPr>
-          <w:b w:val="1"/>
-          <w:bCs w:val="1"/>
-          <w:color w:val="1a1a1a"/>
-          <w:sz w:val="21"/>
-          <w:szCs w:val="21"/>
-          <w:u w:val="single"/>
-          <w:rtl w:val="0"/>
-        </w:rPr>
-        <w:t xml:space="preserve">Other</w:t>
-      </w:r>
-      <w:r>
-        <w:rPr>
-          <w:rtl w:val="0"/>
-        </w:rPr>
-      </w:r>
-    </w:p>
-    <w:p>
-      <w:pPr>
-        <w:keepNext w:val="0"/>
-        <w:keepLines w:val="0"/>
-        <w:pageBreakBefore w:val="0"/>
-        <w:widowControl w:val="1"/>
-        <w:numPr>
-          <w:ilvl w:val="0"/>
-          <w:numId w:val="1"/>
-        </w:numPr>
-        <w:pBdr>
-          <w:top w:space="0" w:sz="0" w:val="nil"/>
-          <w:left w:space="0" w:sz="0" w:val="nil"/>
-          <w:bottom w:space="0" w:sz="0" w:val="nil"/>
-          <w:right w:space="0" w:sz="0" w:val="nil"/>
-          <w:between w:space="0" w:sz="0" w:val="nil"/>
-        </w:pBdr>
-        <w:shd w:fill="auto" w:val="clear"/>
-        <w:spacing w:after="40" w:before="0" w:line="240" w:lineRule="auto"/>
-        <w:ind w:left="403" w:right="0" w:hanging="259"/>
-        <w:jc w:val="left"/>
-        <w:rPr/>
-      </w:pPr>
-      <w:r>
-        <w:rPr>
-          <w:rFonts w:ascii="Calibri" w:cs="Calibri" w:eastAsia="Calibri" w:hAnsi="Calibri"/>
-          <w:b w:val="0"/>
-          <w:bCs w:val="0"/>
-          <w:i w:val="0"/>
-          <w:iCs w:val="0"/>
-          <w:smallCaps w:val="0"/>
-          <w:strike w:val="0"/>
-          <w:color w:val="1a1a1a"/>
-          <w:sz w:val="21"/>
-          <w:szCs w:val="21"/>
-          <w:u w:val="none"/>
-          <w:shd w:fill="auto" w:val="clear"/>
-          <w:vertAlign w:val="baseline"/>
-          <w:rtl w:val="0"/>
-        </w:rPr>
-        <w:t xml:space="preserve">Experience with Agile and Scrum development process</w:t>
+        <w:t xml:space="preserve">Collaboration with Japanese clients and back-end teams; Agile/Scrum; daily communication in English via chat</w:t>
       </w:r>
       <w:r>
         <w:rPr>
@@ -1072,7 +809,7 @@
           <w:vertAlign w:val="baseline"/>
           <w:rtl w:val="0"/>
         </w:rPr>
-        <w:t xml:space="preserve">Develop and maintain front-end for Japanese client projects (outsource)</w:t>
+        <w:t xml:space="preserve">Owner of front-end for Japanese client sites (DeNA group), including wonderia.jp and dena-ailink.com; Lighthouse (Oct 2026): SEO 100/100 and Accessibility 89-90 on both, dena-ailink.com Best Practices 100 and desktop Performance 91 (LCP 1.1s)</w:t>
       </w:r>
       <w:r>
         <w:rPr>
@@ -1120,7 +857,7 @@
           <w:vertAlign w:val="baseline"/>
           <w:rtl w:val="0"/>
         </w:rPr>
-        <w:t xml:space="preserve">Extend and customize Contentful CMS</w:t>
+        <w:t xml:space="preserve">Investigated a production incident on wonderia.jp where Googlebot stopped indexing pages after a multilingual release; worked with the back-end team and traced the root cause to a GCP network component</w:t>
       </w:r>
       <w:r>
         <w:rPr>
@@ -1168,7 +905,7 @@
           <w:vertAlign w:val="baseline"/>
           <w:rtl w:val="0"/>
         </w:rPr>
-        <w:t xml:space="preserve">Designed Contentful content models and built a custom Editor.js extension for content entry, exporting structured data consumed by the front end</w:t>
+        <w:t xml:space="preserve">Maintained Node.js services: applied security patches and upgraded Node.js (v14/v16 to v22-24) on most maintained projects; reduced page size on production sites</w:t>
       </w:r>
       <w:r>
         <w:rPr>
@@ -1216,7 +953,7 @@
           <w:vertAlign w:val="baseline"/>
           <w:rtl w:val="0"/>
         </w:rPr>
-        <w:t xml:space="preserve">Build and maintain CI/CD pipelines with GitHub</w:t>
+        <w:t xml:space="preserve">Designed Contentful content models and built a custom Editor.js extension for content entry, exporting structured data consumed by the front end</w:t>
       </w:r>
       <w:r>
         <w:rPr>
@@ -1264,7 +1001,7 @@
           <w:vertAlign w:val="baseline"/>
           <w:rtl w:val="0"/>
         </w:rPr>
-        <w:t xml:space="preserve">Maintain and develop Node.js services</w:t>
+        <w:t xml:space="preserve">Built and updated UI animation with GSAP, Three.js, Animate.js</w:t>
       </w:r>
       <w:r>
         <w:rPr>
@@ -1312,7 +1049,52 @@
           <w:vertAlign w:val="baseline"/>
           <w:rtl w:val="0"/>
         </w:rPr>
-        <w:t xml:space="preserve">Applied security patches and upgraded Node.js (v14/v16 to v22-24) on most maintained projects; updated UI animations and reduced page size on production sites</w:t>
+        <w:t xml:space="preserve">Built and maintained CI/CD pipelines with GitHub</w:t>
+      </w:r>
+      <w:r>
+        <w:rPr>
+          <w:rtl w:val="0"/>
+        </w:rPr>
+      </w:r>
+    </w:p>
+    <w:p>
+      <w:pPr>
+        <w:spacing w:after="80" w:lineRule="auto"/>
+        <w:rPr/>
+      </w:pPr>
+      <w:r>
+        <w:rPr>
+          <w:i w:val="1"/>
+          <w:iCs w:val="1"/>
+          <w:color w:val="1a1a1a"/>
+          <w:sz w:val="20"/>
+          <w:szCs w:val="20"/>
+          <w:rtl w:val="0"/>
+        </w:rPr>
+        <w:t xml:space="preserve">Framework: Next.js, Nuxt.js, Vite, Node.js, GSAP, Three.js, GraphQL, Redux, jQuery</w:t>
+      </w:r>
+      <w:r>
+        <w:rPr>
+          <w:rtl w:val="0"/>
+        </w:rPr>
+      </w:r>
+    </w:p>
+    <w:p>
+      <w:pPr>
+        <w:spacing w:after="40" w:before="80" w:lineRule="auto"/>
+        <w:rPr/>
+      </w:pPr>
+      <w:r>
+        <w:rPr>
+          <w:b w:val="1"/>
+          <w:bCs w:val="1"/>
+          <w:color w:val="1a1a1a"/>
+          <w:sz w:val="21"/>
+          <w:szCs w:val="21"/>
+          <w:u w:val="single"/>
+          <w:rtl w:val="0"/>
+        </w:rPr>
+        <w:t xml:space="preserve">Project List</w:t>
       </w:r>
       <w:r>
         <w:rPr>
@@ -1360,7 +1142,7 @@
           <w:vertAlign w:val="baseline"/>
           <w:rtl w:val="0"/>
         </w:rPr>
-        <w:t xml:space="preserve">Investigated a production incident on wonderia.jp where Googlebot stopped indexing pages after a multilingual release; worked with the back-end team and traced the root cause to a GCP network component</w:t>
+        <w:t xml:space="preserve">dena.com — Position: Maintain, worked across all pages; Team size: 8</w:t>
       </w:r>
       <w:r>
         <w:rPr>
@@ -1408,7 +1190,7 @@
           <w:vertAlign w:val="baseline"/>
           <w:rtl w:val="0"/>
         </w:rPr>
-        <w:t xml:space="preserve">Build UI animation with GSAP, Three.js, Animate.js</w:t>
+        <w:t xml:space="preserve">alumni.dena.com — Position: Owner; Team size: 3</w:t>
       </w:r>
       <w:r>
         <w:rPr>
@@ -1456,52 +1238,7 @@
           <w:vertAlign w:val="baseline"/>
           <w:rtl w:val="0"/>
         </w:rPr>
-        <w:t xml:space="preserve">Owner of the front-end of wonderia.jp and dena-ailink.com; Lighthouse (Oct 2026): SEO 100/100 and Accessibility 89-90 on both, dena-ailink.com Best Practices 100 and desktop Performance 91 (LCP 1.1s)</w:t>
-      </w:r>
-      <w:r>
-        <w:rPr>
-          <w:rtl w:val="0"/>
-        </w:rPr>
-      </w:r>
-    </w:p>
-    <w:p>
-      <w:pPr>
-        <w:spacing w:after="80" w:lineRule="auto"/>
-        <w:rPr/>
-      </w:pPr>
-      <w:r>
-        <w:rPr>
-          <w:i w:val="1"/>
-          <w:iCs w:val="1"/>
-          <w:color w:val="1a1a1a"/>
-          <w:sz w:val="20"/>
-          <w:szCs w:val="20"/>
-          <w:rtl w:val="0"/>
-        </w:rPr>
-        <w:t xml:space="preserve">Framework: Next.js, Nuxt.js, Vite, Node.js, GSAP, Three.js, GraphQL, Redux, jQuery</w:t>
-      </w:r>
-      <w:r>
-        <w:rPr>
-          <w:rtl w:val="0"/>
-        </w:rPr>
-      </w:r>
-    </w:p>
-    <w:p>
-      <w:pPr>
-        <w:spacing w:after="40" w:before="80" w:lineRule="auto"/>
-        <w:rPr/>
-      </w:pPr>
-      <w:r>
-        <w:rPr>
-          <w:b w:val="1"/>
-          <w:bCs w:val="1"/>
-          <w:color w:val="1a1a1a"/>
-          <w:sz w:val="21"/>
-          <w:szCs w:val="21"/>
-          <w:u w:val="single"/>
-          <w:rtl w:val="0"/>
-        </w:rPr>
-        <w:t xml:space="preserve">Project List</w:t>
+        <w:t xml:space="preserve">go.goinc.jp — Position: Develop and maintain; Team size: 5</w:t>
       </w:r>
       <w:r>
         <w:rPr>
@@ -1549,7 +1286,7 @@
           <w:vertAlign w:val="baseline"/>
           <w:rtl w:val="0"/>
         </w:rPr>
-        <w:t xml:space="preserve">dena.com — Position: Develop and maintain; Team size: 8</w:t>
+        <w:t xml:space="preserve">wonderia.jp — Position: Owner; Team size: 2</w:t>
       </w:r>
       <w:r>
         <w:rPr>
@@ -1597,7 +1334,7 @@
           <w:vertAlign w:val="baseline"/>
           <w:rtl w:val="0"/>
         </w:rPr>
-        <w:t xml:space="preserve">alumi.dena.com — Position: Develop and maintain; Team size: 3</w:t>
+        <w:t xml:space="preserve">dena-ailink.com — Position: Owner; Team size: 2</w:t>
       </w:r>
       <w:r>
         <w:rPr>
@@ -1645,7 +1382,7 @@
           <w:vertAlign w:val="baseline"/>
           <w:rtl w:val="0"/>
         </w:rPr>
-        <w:t xml:space="preserve">go.goinc.jp — Position: Develop and maintain; Team size: 5</w:t>
+        <w:t xml:space="preserve">DeNA Games Tokyo (denagames-tokyo.com) — Position: Owner (development, maintenance, QC and CI/CD); Team size: 3</w:t>
       </w:r>
       <w:r>
         <w:rPr>
@@ -1693,7 +1430,7 @@
           <w:vertAlign w:val="baseline"/>
           <w:rtl w:val="0"/>
         </w:rPr>
-        <w:t xml:space="preserve">wonderia.jp — Position: Develop and maintain; Team size: 2</w:t>
+        <w:t xml:space="preserve">Gambaru — recruitment platform connecting recruiters and job seekers (Next.js, GraphQL, Redux, SCSS). Position: Maintain and fix logic/UI bugs</w:t>
       </w:r>
       <w:r>
         <w:rPr>
@@ -1741,7 +1478,7 @@
           <w:vertAlign w:val="baseline"/>
           <w:rtl w:val="0"/>
         </w:rPr>
-        <w:t xml:space="preserve">dena-ailink.com — Position: Develop and maintain; Team size: 2</w:t>
+        <w:t xml:space="preserve">GO Job — driver recruitment site (Node.js API integration). Position: Develop; handed over to the client's in-house team</w:t>
       </w:r>
       <w:r>
         <w:rPr>
@@ -1789,7 +1526,7 @@
           <w:vertAlign w:val="baseline"/>
           <w:rtl w:val="0"/>
         </w:rPr>
-        <w:t xml:space="preserve">Gambaru — recruitment platform connecting recruiters and job seekers (Next.js, GraphQL, Redux, SCSS). Position: Maintain and fix logic/UI bugs</w:t>
+        <w:t xml:space="preserve">Ckingdom — game landing page (fullpage.js, HTML/CSS, jQuery). Position: Maintain and update layout</w:t>
       </w:r>
       <w:r>
         <w:rPr>
@@ -1837,7 +1574,72 @@
           <w:vertAlign w:val="baseline"/>
           <w:rtl w:val="0"/>
         </w:rPr>
-        <w:t xml:space="preserve">GO Job — driver recruitment site (Node.js API integration). Position: Develop; handed over to the client's in-house team</w:t>
+        <w:t xml:space="preserve">Ido — landing page (HTML/CSS, jQuery). Position: Build website from design</w:t>
+      </w:r>
+      <w:r>
+        <w:rPr>
+          <w:rtl w:val="0"/>
+        </w:rPr>
+      </w:r>
+    </w:p>
+    <w:p>
+      <w:pPr>
+        <w:spacing w:after="60" w:before="180" w:lineRule="auto"/>
+        <w:rPr/>
+      </w:pPr>
+      <w:r>
+        <w:rPr>
+          <w:b w:val="1"/>
+          <w:bCs w:val="1"/>
+          <w:color w:val="1a1a1a"/>
+          <w:sz w:val="22"/>
+          <w:szCs w:val="22"/>
+          <w:rtl w:val="0"/>
+        </w:rPr>
+        <w:t xml:space="preserve">Minerva Solution</w:t>
+      </w:r>
+      <w:r>
+        <w:rPr>
+          <w:color w:val="1a1a1a"/>
+          <w:sz w:val="22"/>
+          <w:szCs w:val="22"/>
+          <w:rtl w:val="0"/>
+        </w:rPr>
+        <w:t xml:space="preserve"> — Front-End Developer (solutions company; projects closed)</w:t>
+      </w:r>
+      <w:r>
+        <w:rPr>
+          <w:i w:val="1"/>
+          <w:iCs w:val="1"/>
+          <w:color w:val="c0392b"/>
+          <w:sz w:val="22"/>
+          <w:szCs w:val="22"/>
+          <w:rtl w:val="0"/>
+        </w:rPr>
+        <w:t xml:space="preserve">    |    08/2020 – 12/2021</w:t>
+      </w:r>
+      <w:r>
+        <w:rPr>
+          <w:rtl w:val="0"/>
+        </w:rPr>
+      </w:r>
+    </w:p>
+    <w:p>
+      <w:pPr>
+        <w:spacing w:after="40" w:before="80" w:lineRule="auto"/>
+        <w:rPr/>
+      </w:pPr>
+      <w:r>
+        <w:rPr>
+          <w:b w:val="1"/>
+          <w:bCs w:val="1"/>
+          <w:color w:val="1a1a1a"/>
+          <w:sz w:val="21"/>
+          <w:szCs w:val="21"/>
+          <w:u w:val="single"/>
+          <w:rtl w:val="0"/>
+        </w:rPr>
+        <w:t xml:space="preserve">Main Responsibilities</w:t>
       </w:r>
       <w:r>
         <w:rPr>
@@ -1885,7 +1687,7 @@
           <w:vertAlign w:val="baseline"/>
           <w:rtl w:val="0"/>
         </w:rPr>
-        <w:t xml:space="preserve">Ckingdom — game landing page (fullpage.js, HTML/CSS, jQuery). Position: Maintain and update layout</w:t>
+        <w:t xml:space="preserve">Slice layout (desktop/mobile) using HTML/JS/CSS</w:t>
       </w:r>
       <w:r>
         <w:rPr>
@@ -1933,17 +1735,39 @@
           <w:vertAlign w:val="baseline"/>
           <w:rtl w:val="0"/>
         </w:rPr>
-        <w:t xml:space="preserve">Ido — landing page (HTML/CSS, jQuery). Position: Build website from design</w:t>
-      </w:r>
-      <w:r>
-        <w:rPr>
-          <w:rtl w:val="0"/>
-        </w:rPr>
-      </w:r>
-    </w:p>
-    <w:p>
-      <w:pPr>
-        <w:spacing w:after="60" w:before="180" w:lineRule="auto"/>
+        <w:t xml:space="preserve">Coordinated with the back-end team to support API/JSON templates</w:t>
+      </w:r>
+      <w:r>
+        <w:rPr>
+          <w:rtl w:val="0"/>
+        </w:rPr>
+      </w:r>
+    </w:p>
+    <w:p>
+      <w:pPr>
+        <w:spacing w:after="80" w:lineRule="auto"/>
+        <w:rPr/>
+      </w:pPr>
+      <w:r>
+        <w:rPr>
+          <w:i w:val="1"/>
+          <w:iCs w:val="1"/>
+          <w:color w:val="1a1a1a"/>
+          <w:sz w:val="20"/>
+          <w:szCs w:val="20"/>
+          <w:rtl w:val="0"/>
+        </w:rPr>
+        <w:t xml:space="preserve">Framework: HTML, CSS/SASS, JS/jQuery, React.js, Vue.js, Ant Design, Three.js, Mapbox, Leaflet, HLS, WebSocket</w:t>
+      </w:r>
+      <w:r>
+        <w:rPr>
+          <w:rtl w:val="0"/>
+        </w:rPr>
+      </w:r>
+    </w:p>
+    <w:p>
+      <w:pPr>
+        <w:spacing w:after="40" w:before="80" w:lineRule="auto"/>
         <w:rPr/>
       </w:pPr>
       <w:r>
@@ -1951,54 +1775,12 @@
           <w:b w:val="1"/>
           <w:bCs w:val="1"/>
           <w:color w:val="1a1a1a"/>
-          <w:sz w:val="22"/>
-          <w:szCs w:val="22"/>
-          <w:rtl w:val="0"/>
-        </w:rPr>
-        <w:t xml:space="preserve">Minerva Solution</w:t>
-      </w:r>
-      <w:r>
-        <w:rPr>
-          <w:color w:val="1a1a1a"/>
-          <w:sz w:val="22"/>
-          <w:szCs w:val="22"/>
-          <w:rtl w:val="0"/>
-        </w:rPr>
-        <w:t xml:space="preserve"> — Front-End Developer</w:t>
-      </w:r>
-      <w:r>
-        <w:rPr>
-          <w:i w:val="1"/>
-          <w:iCs w:val="1"/>
-          <w:color w:val="c0392b"/>
-          <w:sz w:val="22"/>
-          <w:szCs w:val="22"/>
-          <w:rtl w:val="0"/>
-        </w:rPr>
-        <w:t xml:space="preserve">    |    08/2020 – 12/2021</w:t>
-      </w:r>
-      <w:r>
-        <w:rPr>
-          <w:rtl w:val="0"/>
-        </w:rPr>
-      </w:r>
-    </w:p>
-    <w:p>
-      <w:pPr>
-        <w:spacing w:after="40" w:before="80" w:lineRule="auto"/>
-        <w:rPr/>
-      </w:pPr>
-      <w:r>
-        <w:rPr>
-          <w:b w:val="1"/>
-          <w:bCs w:val="1"/>
-          <w:color w:val="1a1a1a"/>
           <w:sz w:val="21"/>
           <w:szCs w:val="21"/>
           <w:u w:val="single"/>
           <w:rtl w:val="0"/>
         </w:rPr>
-        <w:t xml:space="preserve">Main Responsibilities</w:t>
+        <w:t xml:space="preserve">Project List</w:t>
       </w:r>
       <w:r>
         <w:rPr>
@@ -2046,7 +1828,7 @@
           <w:vertAlign w:val="baseline"/>
           <w:rtl w:val="0"/>
         </w:rPr>
-        <w:t xml:space="preserve">Slice layout (desktop/mobile) using HTML/JS/CSS</w:t>
+        <w:t xml:space="preserve">Sale Admin — real estate transaction management. Position: Develop and review source code; Team size: 5</w:t>
       </w:r>
       <w:r>
         <w:rPr>
@@ -2094,52 +1876,7 @@
           <w:vertAlign w:val="baseline"/>
           <w:rtl w:val="0"/>
         </w:rPr>
-        <w:t xml:space="preserve">Coordinated with the back-end team to support API/JSON templates</w:t>
-      </w:r>
-      <w:r>
-        <w:rPr>
-          <w:rtl w:val="0"/>
-        </w:rPr>
-      </w:r>
-    </w:p>
-    <w:p>
-      <w:pPr>
-        <w:spacing w:after="80" w:lineRule="auto"/>
-        <w:rPr/>
-      </w:pPr>
-      <w:r>
-        <w:rPr>
-          <w:i w:val="1"/>
-          <w:iCs w:val="1"/>
-          <w:color w:val="1a1a1a"/>
-          <w:sz w:val="20"/>
-          <w:szCs w:val="20"/>
-          <w:rtl w:val="0"/>
-        </w:rPr>
-        <w:t xml:space="preserve">Framework: HTML, CSS/SASS, JS/jQuery, React.js, Vue.js, Ant Design, Three.js, Mapbox, Leaflet, HLS, WebSocket</w:t>
-      </w:r>
-      <w:r>
-        <w:rPr>
-          <w:rtl w:val="0"/>
-        </w:rPr>
-      </w:r>
-    </w:p>
-    <w:p>
-      <w:pPr>
-        <w:spacing w:after="40" w:before="80" w:lineRule="auto"/>
-        <w:rPr/>
-      </w:pPr>
-      <w:r>
-        <w:rPr>
-          <w:b w:val="1"/>
-          <w:bCs w:val="1"/>
-          <w:color w:val="1a1a1a"/>
-          <w:sz w:val="21"/>
-          <w:szCs w:val="21"/>
-          <w:u w:val="single"/>
-          <w:rtl w:val="0"/>
-        </w:rPr>
-        <w:t xml:space="preserve">Project List</w:t>
+        <w:t xml:space="preserve">Super App for Sale Admin — management of the Sale Admin page. Position: Develop and review source code; Team size: 3</w:t>
       </w:r>
       <w:r>
         <w:rPr>
@@ -2187,7 +1924,7 @@
           <w:vertAlign w:val="baseline"/>
           <w:rtl w:val="0"/>
         </w:rPr>
-        <w:t xml:space="preserve">Sale Admin — real estate transaction management. Position: Develop and review source code; Team size: 5</w:t>
+        <w:t xml:space="preserve">CCTV App — camera management and settings. Position: Develop and review source code; Team size: 3</w:t>
       </w:r>
       <w:r>
         <w:rPr>
@@ -2235,7 +1972,7 @@
           <w:vertAlign w:val="baseline"/>
           <w:rtl w:val="0"/>
         </w:rPr>
-        <w:t xml:space="preserve">Super App for Sale Admin — management of the Sale Admin page. Position: Develop and review source code; Team size: 3</w:t>
+        <w:t xml:space="preserve">Platform Workflow — task management, workflow creation for customers. Position: Develop and review source code; Team size: 2</w:t>
       </w:r>
       <w:r>
         <w:rPr>
@@ -2283,7 +2020,94 @@
           <w:vertAlign w:val="baseline"/>
           <w:rtl w:val="0"/>
         </w:rPr>
-        <w:t xml:space="preserve">CCTV App — camera management and settings. Position: Develop and review source code; Team size: 3</w:t>
+        <w:t xml:space="preserve">Internet Banking — online banking for customers and businesses. Position: Develop and review source code (Vue.js); Team size: 8</w:t>
+      </w:r>
+      <w:r>
+        <w:rPr>
+          <w:rtl w:val="0"/>
+        </w:rPr>
+      </w:r>
+    </w:p>
+    <w:p>
+      <w:pPr>
+        <w:spacing w:after="60" w:before="180" w:lineRule="auto"/>
+        <w:rPr/>
+      </w:pPr>
+      <w:r>
+        <w:rPr>
+          <w:b w:val="1"/>
+          <w:bCs w:val="1"/>
+          <w:color w:val="1a1a1a"/>
+          <w:sz w:val="22"/>
+          <w:szCs w:val="22"/>
+          <w:rtl w:val="0"/>
+        </w:rPr>
+        <w:t xml:space="preserve">Thien Duong Cong Nghe</w:t>
+      </w:r>
+      <w:r>
+        <w:rPr>
+          <w:color w:val="1a1a1a"/>
+          <w:sz w:val="22"/>
+          <w:szCs w:val="22"/>
+          <w:rtl w:val="0"/>
+        </w:rPr>
+        <w:t xml:space="preserve"> — Front-End Developer (solutions company; projects closed)</w:t>
+      </w:r>
+      <w:r>
+        <w:rPr>
+          <w:i w:val="1"/>
+          <w:iCs w:val="1"/>
+          <w:color w:val="c0392b"/>
+          <w:sz w:val="22"/>
+          <w:szCs w:val="22"/>
+          <w:rtl w:val="0"/>
+        </w:rPr>
+        <w:t xml:space="preserve">    |    05/2019 – 08/2020</w:t>
+      </w:r>
+      <w:r>
+        <w:rPr>
+          <w:rtl w:val="0"/>
+        </w:rPr>
+      </w:r>
+    </w:p>
+    <w:p>
+      <w:pPr>
+        <w:spacing w:after="80" w:lineRule="auto"/>
+        <w:rPr/>
+      </w:pPr>
+      <w:r>
+        <w:rPr>
+          <w:i w:val="1"/>
+          <w:iCs w:val="1"/>
+          <w:color w:val="1a1a1a"/>
+          <w:sz w:val="20"/>
+          <w:szCs w:val="20"/>
+          <w:rtl w:val="0"/>
+        </w:rPr>
+        <w:t xml:space="preserve">Framework: React.js, React Native, Redux-Saga, Ant Design</w:t>
+      </w:r>
+      <w:r>
+        <w:rPr>
+          <w:rtl w:val="0"/>
+        </w:rPr>
+      </w:r>
+    </w:p>
+    <w:p>
+      <w:pPr>
+        <w:spacing w:after="40" w:before="80" w:lineRule="auto"/>
+        <w:rPr/>
+      </w:pPr>
+      <w:r>
+        <w:rPr>
+          <w:b w:val="1"/>
+          <w:bCs w:val="1"/>
+          <w:color w:val="1a1a1a"/>
+          <w:sz w:val="21"/>
+          <w:szCs w:val="21"/>
+          <w:u w:val="single"/>
+          <w:rtl w:val="0"/>
+        </w:rPr>
+        <w:t xml:space="preserve">Project List</w:t>
       </w:r>
       <w:r>
         <w:rPr>
@@ -2331,7 +2155,7 @@
           <w:vertAlign w:val="baseline"/>
           <w:rtl w:val="0"/>
         </w:rPr>
-        <w:t xml:space="preserve">Platform Workflow — task management, workflow creation for customers. Position: Develop and review source code; Team size: 2</w:t>
+        <w:t xml:space="preserve">Fixxy Admin Web — member shop information management. Position: Develop with React.js + Ant Design; Team size: 5</w:t>
       </w:r>
       <w:r>
         <w:rPr>
@@ -2379,94 +2203,7 @@
           <w:vertAlign w:val="baseline"/>
           <w:rtl w:val="0"/>
         </w:rPr>
-        <w:t xml:space="preserve">Internet Banking — online banking for customers and businesses. Position: Develop and review source code (Vue.js); Team size: 8</w:t>
-      </w:r>
-      <w:r>
-        <w:rPr>
-          <w:rtl w:val="0"/>
-        </w:rPr>
-      </w:r>
-    </w:p>
-    <w:p>
-      <w:pPr>
-        <w:spacing w:after="60" w:before="180" w:lineRule="auto"/>
-        <w:rPr/>
-      </w:pPr>
-      <w:r>
-        <w:rPr>
-          <w:b w:val="1"/>
-          <w:bCs w:val="1"/>
-          <w:color w:val="1a1a1a"/>
-          <w:sz w:val="22"/>
-          <w:szCs w:val="22"/>
-          <w:rtl w:val="0"/>
-        </w:rPr>
-        <w:t xml:space="preserve">Thien Duong Cong Nghe</w:t>
-      </w:r>
-      <w:r>
-        <w:rPr>
-          <w:color w:val="1a1a1a"/>
-          <w:sz w:val="22"/>
-          <w:szCs w:val="22"/>
-          <w:rtl w:val="0"/>
-        </w:rPr>
-        <w:t xml:space="preserve"> — Front-End Developer</w:t>
-      </w:r>
-      <w:r>
-        <w:rPr>
-          <w:i w:val="1"/>
-          <w:iCs w:val="1"/>
-          <w:color w:val="c0392b"/>
-          <w:sz w:val="22"/>
-          <w:szCs w:val="22"/>
-          <w:rtl w:val="0"/>
-        </w:rPr>
-        <w:t xml:space="preserve">    |    05/2019 – 08/2020</w:t>
-      </w:r>
-      <w:r>
-        <w:rPr>
-          <w:rtl w:val="0"/>
-        </w:rPr>
-      </w:r>
-    </w:p>
-    <w:p>
-      <w:pPr>
-        <w:spacing w:after="80" w:lineRule="auto"/>
-        <w:rPr/>
-      </w:pPr>
-      <w:r>
-        <w:rPr>
-          <w:i w:val="1"/>
-          <w:iCs w:val="1"/>
-          <w:color w:val="1a1a1a"/>
-          <w:sz w:val="20"/>
-          <w:szCs w:val="20"/>
-          <w:rtl w:val="0"/>
-        </w:rPr>
-        <w:t xml:space="preserve">Framework: React.js, React Native, Redux-Saga, Ant Design</w:t>
-      </w:r>
-      <w:r>
-        <w:rPr>
-          <w:rtl w:val="0"/>
-        </w:rPr>
-      </w:r>
-    </w:p>
-    <w:p>
-      <w:pPr>
-        <w:spacing w:after="40" w:before="80" w:lineRule="auto"/>
-        <w:rPr/>
-      </w:pPr>
-      <w:r>
-        <w:rPr>
-          <w:b w:val="1"/>
-          <w:bCs w:val="1"/>
-          <w:color w:val="1a1a1a"/>
-          <w:sz w:val="21"/>
-          <w:szCs w:val="21"/>
-          <w:u w:val="single"/>
-          <w:rtl w:val="0"/>
-        </w:rPr>
-        <w:t xml:space="preserve">Project List</w:t>
+        <w:t xml:space="preserve">Emartmall App — mobile shopping app. Position: Support mobile app development with React Native + Saga; Team size: 3</w:t>
       </w:r>
       <w:r>
         <w:rPr>
@@ -2514,102 +2251,6 @@
           <w:vertAlign w:val="baseline"/>
           <w:rtl w:val="0"/>
         </w:rPr>
-        <w:t xml:space="preserve">Fixxy Admin Web — member shop information management. Position: Develop with React.js + Ant Design; Team size: 5</w:t>
-      </w:r>
-      <w:r>
-        <w:rPr>
-          <w:rtl w:val="0"/>
-        </w:rPr>
-      </w:r>
-    </w:p>
-    <w:p>
-      <w:pPr>
-        <w:keepNext w:val="0"/>
-        <w:keepLines w:val="0"/>
-        <w:pageBreakBefore w:val="0"/>
-        <w:widowControl w:val="1"/>
-        <w:numPr>
-          <w:ilvl w:val="0"/>
-          <w:numId w:val="2"/>
-        </w:numPr>
-        <w:pBdr>
-          <w:top w:space="0" w:sz="0" w:val="nil"/>
-          <w:left w:space="0" w:sz="0" w:val="nil"/>
-          <w:bottom w:space="0" w:sz="0" w:val="nil"/>
-          <w:right w:space="0" w:sz="0" w:val="nil"/>
-          <w:between w:space="0" w:sz="0" w:val="nil"/>
-        </w:pBdr>
-        <w:shd w:fill="auto" w:val="clear"/>
-        <w:spacing w:after="40" w:before="0" w:line="240" w:lineRule="auto"/>
-        <w:ind w:left="792" w:right="0" w:hanging="259"/>
-        <w:jc w:val="left"/>
-        <w:rPr/>
-      </w:pPr>
-      <w:r>
-        <w:rPr>
-          <w:rFonts w:ascii="Calibri" w:cs="Calibri" w:eastAsia="Calibri" w:hAnsi="Calibri"/>
-          <w:b w:val="0"/>
-          <w:bCs w:val="0"/>
-          <w:i w:val="0"/>
-          <w:iCs w:val="0"/>
-          <w:smallCaps w:val="0"/>
-          <w:strike w:val="0"/>
-          <w:color w:val="1a1a1a"/>
-          <w:sz w:val="21"/>
-          <w:szCs w:val="21"/>
-          <w:u w:val="none"/>
-          <w:shd w:fill="auto" w:val="clear"/>
-          <w:vertAlign w:val="baseline"/>
-          <w:rtl w:val="0"/>
-        </w:rPr>
-        <w:t xml:space="preserve">Emartmall App — mobile shopping app. Position: Develop with React Native + Saga; Team size: 3</w:t>
-      </w:r>
-      <w:r>
-        <w:rPr>
-          <w:rtl w:val="0"/>
-        </w:rPr>
-      </w:r>
-    </w:p>
-    <w:p>
-      <w:pPr>
-        <w:keepNext w:val="0"/>
-        <w:keepLines w:val="0"/>
-        <w:pageBreakBefore w:val="0"/>
-        <w:widowControl w:val="1"/>
-        <w:numPr>
-          <w:ilvl w:val="0"/>
-          <w:numId w:val="2"/>
-        </w:numPr>
-        <w:pBdr>
-          <w:top w:space="0" w:sz="0" w:val="nil"/>
-          <w:left w:space="0" w:sz="0" w:val="nil"/>
-          <w:bottom w:space="0" w:sz="0" w:val="nil"/>
-          <w:right w:space="0" w:sz="0" w:val="nil"/>
-          <w:between w:space="0" w:sz="0" w:val="nil"/>
-        </w:pBdr>
-        <w:shd w:fill="auto" w:val="clear"/>
-        <w:spacing w:after="40" w:before="0" w:line="240" w:lineRule="auto"/>
-        <w:ind w:left="792" w:right="0" w:hanging="259"/>
-        <w:jc w:val="left"/>
-        <w:rPr/>
-      </w:pPr>
-      <w:r>
-        <w:rPr>
-          <w:rFonts w:ascii="Calibri" w:cs="Calibri" w:eastAsia="Calibri" w:hAnsi="Calibri"/>
-          <w:b w:val="0"/>
-          <w:bCs w:val="0"/>
-          <w:i w:val="0"/>
-          <w:iCs w:val="0"/>
-          <w:smallCaps w:val="0"/>
-          <w:strike w:val="0"/>
-          <w:color w:val="1a1a1a"/>
-          <w:sz w:val="21"/>
-          <w:szCs w:val="21"/>
-          <w:u w:val="none"/>
-          <w:shd w:fill="auto" w:val="clear"/>
-          <w:vertAlign w:val="baseline"/>
-          <w:rtl w:val="0"/>
-        </w:rPr>
         <w:t xml:space="preserve">ERP App — karaoke room and reception management. Position: Develop with React Native + Hooks + Saga; Team size: 3</w:t>
       </w:r>
       <w:r>
@@ -2656,7 +2297,7 @@
           <w:szCs w:val="21"/>
           <w:rtl w:val="0"/>
         </w:rPr>
-        <w:t xml:space="preserve">University of Science (HCMUS) — 2013 – 2016</w:t>
+        <w:t xml:space="preserve">University of Science (HCMUS) — 2013 – 2017</w:t>
       </w:r>
       <w:r>
         <w:rPr>
@@ -2676,7 +2317,7 @@
           <w:szCs w:val="21"/>
           <w:rtl w:val="0"/>
         </w:rPr>
-        <w:t xml:space="preserve">Major: Information Technology</w:t>
+        <w:t xml:space="preserve">College Diploma (Associate), Major: Information Technology — graduated 2017</w:t>
       </w:r>
       <w:r>
         <w:rPr>
@@ -2722,99 +2363,7 @@
           <w:szCs w:val="21"/>
           <w:rtl w:val="0"/>
         </w:rPr>
-        <w:t xml:space="preserve">Solid English reading and writing skills, with basic conversational ability.</w:t>
-      </w:r>
-      <w:r>
-        <w:rPr>
-          <w:rtl w:val="0"/>
-        </w:rPr>
-      </w:r>
-    </w:p>
-    <w:p>
-      <w:pPr>
-        <w:pStyle w:val="Heading1"/>
-        <w:pBdr>
-          <w:bottom w:color="2e7d32" w:space="2" w:sz="6" w:val="single"/>
-        </w:pBdr>
-        <w:spacing w:after="100" w:before="260" w:lineRule="auto"/>
-        <w:rPr/>
-      </w:pPr>
-      <w:r>
-        <w:rPr>
-          <w:b w:val="1"/>
-          <w:bCs w:val="1"/>
-          <w:color w:val="2e7d32"/>
-          <w:sz w:val="24"/>
-          <w:szCs w:val="24"/>
-          <w:rtl w:val="0"/>
-        </w:rPr>
-        <w:t xml:space="preserve">FAVORITE SENTENCE</w:t>
-      </w:r>
-      <w:r>
-        <w:rPr>
-          <w:rtl w:val="0"/>
-        </w:rPr>
-      </w:r>
-    </w:p>
-    <w:p>
-      <w:pPr>
-        <w:spacing w:after="80" w:lineRule="auto"/>
-        <w:rPr/>
-      </w:pPr>
-      <w:r>
-        <w:rPr>
-          <w:color w:val="1a1a1a"/>
-          <w:sz w:val="21"/>
-          <w:szCs w:val="21"/>
-          <w:rtl w:val="0"/>
-        </w:rPr>
-        <w:t xml:space="preserve">“Keep trying and success will come!”</w:t>
-      </w:r>
-      <w:r>
-        <w:rPr>
-          <w:rtl w:val="0"/>
-        </w:rPr>
-      </w:r>
-    </w:p>
-    <w:p>
-      <w:pPr>
-        <w:pStyle w:val="Heading1"/>
-        <w:pBdr>
-          <w:bottom w:color="2e7d32" w:space="2" w:sz="6" w:val="single"/>
-        </w:pBdr>
-        <w:spacing w:after="100" w:before="260" w:lineRule="auto"/>
-        <w:rPr/>
-      </w:pPr>
-      <w:r>
-        <w:rPr>
-          <w:b w:val="1"/>
-          <w:bCs w:val="1"/>
-          <w:color w:val="2e7d32"/>
-          <w:sz w:val="24"/>
-          <w:szCs w:val="24"/>
-          <w:rtl w:val="0"/>
-        </w:rPr>
-        <w:t xml:space="preserve">INTERESTS</w:t>
-      </w:r>
-      <w:r>
-        <w:rPr>
-          <w:rtl w:val="0"/>
-        </w:rPr>
-      </w:r>
-    </w:p>
-    <w:p>
-      <w:pPr>
-        <w:spacing w:after="80" w:lineRule="auto"/>
-        <w:rPr/>
-      </w:pPr>
-      <w:r>
-        <w:rPr>
-          <w:color w:val="1a1a1a"/>
-          <w:sz w:val="21"/>
-          <w:szCs w:val="21"/>
-          <w:rtl w:val="0"/>
-        </w:rPr>
-        <w:t xml:space="preserve">Swimming, singing, traveling, trekking.</w:t>
+        <w:t xml:space="preserve">English: solid reading and writing, daily chat with Japanese clients; basic conversational ability, meetings held with an interpreter.</w:t>
       </w:r>
       <w:r>
         <w:rPr>

</xml_diff>

<commit_message>
feat: refine front-end positioning, GO Inc. role and CV details
</commit_message>
<xml_diff>
--- a/cv/CV_NGUYEN_TRUNG_HUY_FRONTEND_ATS.docx
+++ b/cv/CV_NGUYEN_TRUNG_HUY_FRONTEND_ATS.docx
@@ -148,36 +148,6 @@
     </w:p>
     <w:p>
       <w:pPr>
-        <w:spacing w:after="30" w:lineRule="auto"/>
-        <w:rPr>
-          <w:color w:val="1a1a1a"/>
-          <w:sz w:val="21"/>
-          <w:szCs w:val="21"/>
-        </w:rPr>
-      </w:pPr>
-      <w:r>
-        <w:rPr>
-          <w:b w:val="1"/>
-          <w:bCs w:val="1"/>
-          <w:color w:val="2e7d32"/>
-          <w:sz w:val="21"/>
-          <w:szCs w:val="21"/>
-          <w:rtl w:val="0"/>
-        </w:rPr>
-        <w:t xml:space="preserve">Location: </w:t>
-      </w:r>
-      <w:r>
-        <w:rPr>
-          <w:color w:val="1a1a1a"/>
-          <w:sz w:val="21"/>
-          <w:szCs w:val="21"/>
-          <w:rtl w:val="0"/>
-        </w:rPr>
-        <w:t xml:space="preserve">Binh Trung Ward, Ho Chi Minh City, Vietnam</w:t>
-      </w:r>
-    </w:p>
-    <w:p>
-      <w:pPr>
         <w:pStyle w:val="Heading1"/>
         <w:pBdr>
           <w:bottom w:color="2e7d32" w:space="2" w:sz="6" w:val="single"/>
@@ -214,7 +184,7 @@
           <w:szCs w:val="21"/>
           <w:rtl w:val="0"/>
         </w:rPr>
-        <w:t xml:space="preserve">Front-End Developer with 7+ years building and maintaining production websites for Japanese clients, including the DeNA group (Next.js, Nuxt.js, React, Vue.js). Owner of the wonderia.jp and dena-ailink.com front-end: upgraded Node.js to v22-24, applied security patches, and traced a Googlebot indexing outage to a GCP network component with the back-end team. Experienced with Contentful (content modeling, custom Editor.js extension), GitHub Actions CI/CD and GSAP/Three.js animation. Built Node.js API-integration services for GO Job, a driver recruitment site later handed over to the client. Long-term goal: grow into a Fullstack Developer, currently strengthening SQL and database skills.</w:t>
+        <w:t xml:space="preserve">Front-End Developer with 7+ years of experience, many of them building and maintaining production websites for Japanese clients, including the DeNA group (Next.js, Nuxt.js, React, Vue.js). Owner of the wonderia.jp and dena-ailink.com front-end: upgraded Node.js to v22-24, applied security patches, and traced a Googlebot indexing outage to a GCP network component with the back-end team. Experienced with Contentful (content modeling, custom Editor.js extension), GitHub Actions CI/CD and GSAP/Three.js animation. Built Node.js API-integration services for GO Job, a driver recruitment site later handed over to the client. Long-term goal: grow into a Fullstack Developer, currently strengthening SQL and database skills.</w:t>
       </w:r>
       <w:r>
         <w:rPr>
@@ -1238,7 +1208,7 @@
           <w:vertAlign w:val="baseline"/>
           <w:rtl w:val="0"/>
         </w:rPr>
-        <w:t xml:space="preserve">go.goinc.jp — Position: Develop and maintain; Team size: 5</w:t>
+        <w:t xml:space="preserve">go.goinc.jp — Position: Develop and maintain (Contentful security fixes, news content model with auto-generated integer URLs, new content features, Contentful export to JSON/Markdown for the front end); Team size: 5</w:t>
       </w:r>
       <w:r>
         <w:rPr>
@@ -1924,7 +1894,7 @@
           <w:vertAlign w:val="baseline"/>
           <w:rtl w:val="0"/>
         </w:rPr>
-        <w:t xml:space="preserve">CCTV App — camera management and settings. Position: Develop and review source code; Team size: 3</w:t>
+        <w:t xml:space="preserve">CCTV App — camera management and settings, including safe-zone detection in camera view. Position: Develop and review source code; Team size: 3</w:t>
       </w:r>
       <w:r>
         <w:rPr>

</xml_diff>

<commit_message>
chore: add TypeScript and AI skills to CV, strip private location line
</commit_message>
<xml_diff>
--- a/cv/CV_NGUYEN_TRUNG_HUY_FRONTEND_ATS.docx
+++ b/cv/CV_NGUYEN_TRUNG_HUY_FRONTEND_ATS.docx
@@ -281,7 +281,7 @@
           <w:vertAlign w:val="baseline"/>
           <w:rtl w:val="0"/>
         </w:rPr>
-        <w:t xml:space="preserve">Front-end: Next.js, Nuxt.js, React.js, Vue.js, Vite, HTML5, CSS3, SASS, Tailwind CSS, responsive design</w:t>
+        <w:t xml:space="preserve">Front-end: TypeScript, Next.js, Nuxt.js, React.js, Vue.js, Vite, HTML5, CSS3, SASS, Tailwind CSS, responsive design</w:t>
       </w:r>
       <w:r>
         <w:rPr>
@@ -474,6 +474,54 @@
           <w:rtl w:val="0"/>
         </w:rPr>
         <w:t xml:space="preserve">CI/CD &amp; tooling: GitHub Actions, Git</w:t>
+      </w:r>
+      <w:r>
+        <w:rPr>
+          <w:rtl w:val="0"/>
+        </w:rPr>
+      </w:r>
+    </w:p>
+    <w:p>
+      <w:pPr>
+        <w:keepNext w:val="0"/>
+        <w:keepLines w:val="0"/>
+        <w:pageBreakBefore w:val="0"/>
+        <w:widowControl w:val="1"/>
+        <w:numPr>
+          <w:ilvl w:val="0"/>
+          <w:numId w:val="1"/>
+        </w:numPr>
+        <w:pBdr>
+          <w:top w:space="0" w:sz="0" w:val="nil"/>
+          <w:left w:space="0" w:sz="0" w:val="nil"/>
+          <w:bottom w:space="0" w:sz="0" w:val="nil"/>
+          <w:right w:space="0" w:sz="0" w:val="nil"/>
+          <w:between w:space="0" w:sz="0" w:val="nil"/>
+        </w:pBdr>
+        <w:shd w:fill="auto" w:val="clear"/>
+        <w:spacing w:after="40" w:before="0" w:line="240" w:lineRule="auto"/>
+        <w:ind w:left="403" w:right="0" w:hanging="259"/>
+        <w:jc w:val="left"/>
+        <w:rPr/>
+      </w:pPr>
+      <w:r>
+        <w:rPr>
+          <w:rFonts w:ascii="Calibri" w:cs="Calibri" w:eastAsia="Calibri" w:hAnsi="Calibri"/>
+          <w:b w:val="0"/>
+          <w:bCs w:val="0"/>
+          <w:i w:val="0"/>
+          <w:iCs w:val="0"/>
+          <w:smallCaps w:val="0"/>
+          <w:strike w:val="0"/>
+          <w:color w:val="1a1a1a"/>
+          <w:sz w:val="21"/>
+          <w:szCs w:val="21"/>
+          <w:u w:val="none"/>
+          <w:shd w:fill="auto" w:val="clear"/>
+          <w:vertAlign w:val="baseline"/>
+          <w:rtl w:val="0"/>
+        </w:rPr>
+        <w:t xml:space="preserve">AI-assisted development: Claude Code (daily), AI agents &amp; subagents, MCP, local LLM (Ollama), prompt &amp; context engineering</w:t>
       </w:r>
       <w:r>
         <w:rPr>

</xml_diff>